<commit_message>
feat: humidity sensor, live threat score, realistic sound levels
- Agent: forward Pi humidity as a first-class SensorReading; pass real
  noise dB values through (was clamped to 40/80); noise threshold 400→65
- Threat score redesigned: live component (motion now +4, loud now +3)
  plus per-event tail decaying over 90s — ring spikes on activity and
  relaxes to 0 when quiet (was permanently pegged at 10)
- App: humidity sensor type with dashboard tile (sky-blue water drop),
  live-feed drift chart, and hero navigation
- Pi publisher: DHT11 via kernel IIO driver (adafruit lib blocks on
  64-bit Pi OS), sound pin corrected to GPIO 27 (found via pin scan),
  pulse-rate → 40-90 dB mapping, sound LED on GPIO 21, buzzer 25°C
- Report: pins, wire format, thresholds, new features documented

Co-Authored-By: Claude Fable 5 <noreply@anthropic.com>
</commit_message>
<xml_diff>
--- a/SentryAgent_Project_Report.docx
+++ b/SentryAgent_Project_Report.docx
@@ -550,13 +550,7 @@
         <w:ind w:left="360"/>
       </w:pPr>
       <w:r>
-        <w:rPr>
-          <w:rFonts w:ascii="Calibri" w:hAnsi="Calibri"/>
-          <w:b w:val="0"/>
-          <w:i w:val="0"/>
-          <w:sz w:val="22"/>
-        </w:rPr>
-        <w:t>The agent publishes SecurityState (~every 5 seconds), SecurityEvent, and AgentDecision messages to MQTT.</w:t>
+        <w:t>The agent publishes SecurityState (on every telemetry tick, ~2 s), SecurityEvent, and AgentDecision messages to MQTT.</w:t>
       </w:r>
     </w:p>
     <w:p>
@@ -1235,11 +1229,7 @@
           </w:tcPr>
           <w:p>
             <w:r>
-              <w:rPr>
-                <w:rFonts w:ascii="Calibri" w:hAnsi="Calibri"/>
-                <w:sz w:val="20"/>
-              </w:rPr>
-              <w:t>GPIO 17</w:t>
+              <w:t>GPIO 22</w:t>
             </w:r>
           </w:p>
         </w:tc>
@@ -1250,10 +1240,6 @@
           </w:tcPr>
           <w:p>
             <w:r>
-              <w:rPr>
-                <w:rFonts w:ascii="Calibri" w:hAnsi="Calibri"/>
-                <w:sz w:val="20"/>
-              </w:rPr>
               <w:t>motion: Active / Inactive</w:t>
             </w:r>
           </w:p>
@@ -1282,11 +1268,7 @@
           </w:tcPr>
           <w:p>
             <w:r>
-              <w:rPr>
-                <w:rFonts w:ascii="Calibri" w:hAnsi="Calibri"/>
-                <w:sz w:val="20"/>
-              </w:rPr>
-              <w:t>Analog comparator</w:t>
+              <w:t>Digital comparator (LM393)</w:t>
             </w:r>
           </w:p>
         </w:tc>
@@ -1297,10 +1279,6 @@
           </w:tcPr>
           <w:p>
             <w:r>
-              <w:rPr>
-                <w:rFonts w:ascii="Calibri" w:hAnsi="Calibri"/>
-                <w:sz w:val="20"/>
-              </w:rPr>
               <w:t>GPIO 27</w:t>
             </w:r>
           </w:p>
@@ -1312,11 +1290,7 @@
           </w:tcPr>
           <w:p>
             <w:r>
-              <w:rPr>
-                <w:rFonts w:ascii="Calibri" w:hAnsi="Calibri"/>
-                <w:sz w:val="20"/>
-              </w:rPr>
-              <w:t>noise: raw ADC value (~120–750)</w:t>
+              <w:t>noise: 40-90 dB-scale (pulse-rate mapped)</w:t>
             </w:r>
           </w:p>
         </w:tc>
@@ -1344,11 +1318,7 @@
           </w:tcPr>
           <w:p>
             <w:r>
-              <w:rPr>
-                <w:rFonts w:ascii="Calibri" w:hAnsi="Calibri"/>
-                <w:sz w:val="20"/>
-              </w:rPr>
-              <w:t>Digital temp/humidity</w:t>
+              <w:t>Digital temp/humidity (kernel IIO driver)</w:t>
             </w:r>
           </w:p>
         </w:tc>
@@ -1359,11 +1329,7 @@
           </w:tcPr>
           <w:p>
             <w:r>
-              <w:rPr>
-                <w:rFonts w:ascii="Calibri" w:hAnsi="Calibri"/>
-                <w:sz w:val="20"/>
-              </w:rPr>
-              <w:t>GPIO 4</w:t>
+              <w:t>GPIO 23</w:t>
             </w:r>
           </w:p>
         </w:tc>
@@ -1374,11 +1340,7 @@
           </w:tcPr>
           <w:p>
             <w:r>
-              <w:rPr>
-                <w:rFonts w:ascii="Calibri" w:hAnsi="Calibri"/>
-                <w:sz w:val="20"/>
-              </w:rPr>
-              <w:t>temperature (°C), humidity (%)</w:t>
+              <w:t>temperature (degC), humidity (%)</w:t>
             </w:r>
           </w:p>
         </w:tc>
@@ -1445,6 +1407,132 @@
           </w:p>
         </w:tc>
       </w:tr>
+      <w:tr>
+        <w:tc>
+          <w:tcPr>
+            <w:tcW w:type="dxa" w:w="2280"/>
+          </w:tcPr>
+          <w:p>
+            <w:r>
+              <w:t>Active Buzzer</w:t>
+            </w:r>
+          </w:p>
+        </w:tc>
+        <w:tc>
+          <w:tcPr>
+            <w:tcW w:type="dxa" w:w="2280"/>
+          </w:tcPr>
+          <w:p>
+            <w:r>
+              <w:t>Digital out</w:t>
+            </w:r>
+          </w:p>
+        </w:tc>
+        <w:tc>
+          <w:tcPr>
+            <w:tcW w:type="dxa" w:w="2280"/>
+          </w:tcPr>
+          <w:p>
+            <w:r>
+              <w:t>GPIO 18</w:t>
+            </w:r>
+          </w:p>
+        </w:tc>
+        <w:tc>
+          <w:tcPr>
+            <w:tcW w:type="dxa" w:w="2280"/>
+          </w:tcPr>
+          <w:p>
+            <w:r>
+              <w:t>Fires when temp exceeds threshold or via app command</w:t>
+            </w:r>
+          </w:p>
+        </w:tc>
+      </w:tr>
+      <w:tr>
+        <w:tc>
+          <w:tcPr>
+            <w:tcW w:type="dxa" w:w="2280"/>
+          </w:tcPr>
+          <w:p>
+            <w:r>
+              <w:t>Status LEDs</w:t>
+            </w:r>
+          </w:p>
+        </w:tc>
+        <w:tc>
+          <w:tcPr>
+            <w:tcW w:type="dxa" w:w="2280"/>
+          </w:tcPr>
+          <w:p>
+            <w:r>
+              <w:t>Digital out</w:t>
+            </w:r>
+          </w:p>
+        </w:tc>
+        <w:tc>
+          <w:tcPr>
+            <w:tcW w:type="dxa" w:w="2280"/>
+          </w:tcPr>
+          <w:p>
+            <w:r>
+              <w:t>GPIO 13/5/19/26/21</w:t>
+            </w:r>
+          </w:p>
+        </w:tc>
+        <w:tc>
+          <w:tcPr>
+            <w:tcW w:type="dxa" w:w="2280"/>
+          </w:tcPr>
+          <w:p>
+            <w:r>
+              <w:t>Armed, high-temp, high-humidity, motion, sound indicators</w:t>
+            </w:r>
+          </w:p>
+        </w:tc>
+      </w:tr>
+      <w:tr>
+        <w:tc>
+          <w:tcPr>
+            <w:tcW w:type="dxa" w:w="2280"/>
+          </w:tcPr>
+          <w:p>
+            <w:r>
+              <w:t>Arm/Disarm Button</w:t>
+            </w:r>
+          </w:p>
+        </w:tc>
+        <w:tc>
+          <w:tcPr>
+            <w:tcW w:type="dxa" w:w="2280"/>
+          </w:tcPr>
+          <w:p>
+            <w:r>
+              <w:t>Digital in (pull-up)</w:t>
+            </w:r>
+          </w:p>
+        </w:tc>
+        <w:tc>
+          <w:tcPr>
+            <w:tcW w:type="dxa" w:w="2280"/>
+          </w:tcPr>
+          <w:p>
+            <w:r>
+              <w:t>GPIO 6</w:t>
+            </w:r>
+          </w:p>
+        </w:tc>
+        <w:tc>
+          <w:tcPr>
+            <w:tcW w:type="dxa" w:w="2280"/>
+          </w:tcPr>
+          <w:p>
+            <w:r>
+              <w:t>Publishes arm/disarm request over MQTT</w:t>
+            </w:r>
+          </w:p>
+        </w:tc>
+      </w:tr>
     </w:tbl>
     <w:p>
       <w:pPr>
@@ -1460,22 +1548,18 @@
     </w:p>
     <w:p>
       <w:r>
-        <w:rPr>
-          <w:rFonts w:ascii="Calibri" w:hAnsi="Calibri"/>
-          <w:b w:val="0"/>
-          <w:i w:val="0"/>
-          <w:sz w:val="22"/>
-        </w:rPr>
-        <w:t>The Pi publishes a single JSON object every second to iot/pi/telemetry:</w:t>
+        <w:t>The Pi publishes a single JSON object every 2 seconds to iot/pi/telemetry:</w:t>
       </w:r>
     </w:p>
     <w:p>
       <w:r>
-        <w:rPr>
-          <w:rFonts w:ascii="Courier New" w:hAnsi="Courier New"/>
-          <w:sz w:val="18"/>
-        </w:rPr>
-        <w:t>{"motion": "Active", "noise": 748, "temperature": 24.5, "humidity": 55.0, "timestamp": "2026-06-06T12:00:00Z"}</w:t>
+        <w:t>{"temperature": 23.8, "humidity": 67.0, "motion": "Active", "noise": 51.8, "mode": "Armed", "buzzer": "OFF", "timestamp": 1781120000}</w:t>
+      </w:r>
+    </w:p>
+    <w:p>
+      <w:pPr/>
+      <w:r>
+        <w:t>Sound processing: the LM393 module outputs only a binary pulse when the microphone level crosses a potentiometer-set threshold. To obtain a continuous, realistic reading, the publisher counts comparator pulses with a GPIO interrupt callback (so even ~1 ms spikes are never missed) and maps the pulse rate to a 40-90 dB-style scale: 40 in silence, ~55 for a clap, ~70 for conversation, 90 for sustained loud noise. A dedicated sound LED (GPIO 21) lights instantly on detection for on-device feedback.</w:t>
       </w:r>
     </w:p>
     <w:p>
@@ -1492,13 +1576,7 @@
     </w:p>
     <w:p>
       <w:r>
-        <w:rPr>
-          <w:rFonts w:ascii="Calibri" w:hAnsi="Calibri"/>
-          <w:b w:val="0"/>
-          <w:i w:val="0"/>
-          <w:sz w:val="22"/>
-        </w:rPr>
-        <w:t>For the university demo, the laptop shares its UA Wi-Fi connection to the Pi over Ethernet (Internet Connection Sharing). This gives the Pi a stable DHCP IP (192.168.137.x) without requiring WPA2-Enterprise credentials on the Pi itself. The Pi scripts are configured with the laptop LAN IP (192.168.137.1) as the MQTT and camera relay target.</w:t>
+        <w:t>For the university demo, the laptop shares its UA Wi-Fi connection to the Pi over Ethernet (Internet Connection Sharing). This gives the Pi a stable DHCP IP (192.168.137.x) without requiring WPA2-Enterprise credentials on the Pi itself. The Pi scripts are configured with the laptop LAN IP (192.168.137.1) as the MQTT and camera relay target. The Pi is assigned a permanent static address (192.168.137.38) via a NetworkManager profile, and a crontab @reboot entry launches the sensor publisher and camera streamer automatically at boot, making the demo setup plug-and-play.</w:t>
       </w:r>
     </w:p>
     <w:p>
@@ -2845,11 +2923,7 @@
           </w:tcPr>
           <w:p>
             <w:r>
-              <w:rPr>
-                <w:rFonts w:ascii="Calibri" w:hAnsi="Calibri"/>
-                <w:sz w:val="20"/>
-              </w:rPr>
-              <w:t>Level &gt; 85 dB</w:t>
+              <w:t>Level &gt;= 80 dB</w:t>
             </w:r>
           </w:p>
         </w:tc>
@@ -2892,11 +2966,7 @@
           </w:tcPr>
           <w:p>
             <w:r>
-              <w:rPr>
-                <w:rFonts w:ascii="Calibri" w:hAnsi="Calibri"/>
-                <w:sz w:val="20"/>
-              </w:rPr>
-              <w:t>Level &gt; 65 dB</w:t>
+              <w:t>Level 60-79 dB</w:t>
             </w:r>
           </w:p>
         </w:tc>
@@ -3838,11 +3908,7 @@
           </w:tcPr>
           <w:p>
             <w:r>
-              <w:rPr>
-                <w:rFonts w:ascii="Calibri" w:hAnsi="Calibri"/>
-                <w:sz w:val="20"/>
-              </w:rPr>
-              <w:t>Animated threat ring, sensor tiles, arm/disarm, siren, recent events, activity strip, smart insight chips</w:t>
+              <w:t>Animated threat ring (live score, 90s decay), four sensor tiles (motion, sound, temperature, humidity), arm/disarm, buzzer trigger</w:t>
             </w:r>
           </w:p>
         </w:tc>
@@ -4120,11 +4186,7 @@
           </w:tcPr>
           <w:p>
             <w:r>
-              <w:rPr>
-                <w:rFonts w:ascii="Calibri" w:hAnsi="Calibri"/>
-                <w:sz w:val="20"/>
-              </w:rPr>
-              <w:t>Rolling 1m/5m/10m sensor charts: sound area, temperature line, motion histogram</w:t>
+              <w:t>Rolling 1m/5m/10m charts: sound area chart, temperature line, humidity line, motion histogram</w:t>
             </w:r>
           </w:p>
         </w:tc>
@@ -5394,22 +5456,7 @@
     </w:p>
     <w:p>
       <w:r>
-        <w:rPr>
-          <w:rFonts w:ascii="Calibri" w:hAnsi="Calibri"/>
-          <w:b/>
-          <w:i w:val="0"/>
-          <w:sz w:val="22"/>
-        </w:rPr>
-        <w:t xml:space="preserve">State Ticker: </w:t>
-      </w:r>
-      <w:r>
-        <w:rPr>
-          <w:rFonts w:ascii="Calibri" w:hAnsi="Calibri"/>
-          <w:b w:val="0"/>
-          <w:i w:val="0"/>
-          <w:sz w:val="22"/>
-        </w:rPr>
-        <w:t>Every 5 seconds, the orchestrator computes a composite threat_score from recent events, persists the SecurityState, and publishes it to home/agent/state (retained).</w:t>
+        <w:t>State Ticker: The orchestrator publishes SecurityState on every telemetry tick. The threat_score is computed live: motion currently detected adds 4, loud sound adds 3, and each recent event contributes a tail that decays linearly over 90 seconds — so the ring spikes the moment something happens and relaxes to zero shortly after the room goes quiet.</w:t>
       </w:r>
     </w:p>
     <w:p>
@@ -6147,11 +6194,7 @@
           </w:tcPr>
           <w:p>
             <w:r>
-              <w:rPr>
-                <w:rFonts w:ascii="Calibri" w:hAnsi="Calibri"/>
-                <w:sz w:val="20"/>
-              </w:rPr>
-              <w:t>Every 5 seconds</w:t>
+              <w:t>Every 2 seconds (per Pi telemetry tick)</w:t>
             </w:r>
           </w:p>
         </w:tc>
@@ -6179,11 +6222,7 @@
           </w:tcPr>
           <w:p>
             <w:r>
-              <w:rPr>
-                <w:rFonts w:ascii="Calibri" w:hAnsi="Calibri"/>
-                <w:sz w:val="20"/>
-              </w:rPr>
-              <w:t>~10 fps (JPEG over WebSocket)</w:t>
+              <w:t>~8-10 fps (JPEG over WebSocket, measured)</w:t>
             </w:r>
           </w:p>
         </w:tc>
@@ -6462,6 +6501,22 @@
     </w:p>
     <w:p>
       <w:pPr>
+        <w:pStyle w:val="ListBullet"/>
+      </w:pPr>
+      <w:r>
+        <w:t>Continuous sound levels derived from a binary comparator via interrupt pulse-rate mapping, plus a live threat ring with per-event 90-second decay.</w:t>
+      </w:r>
+    </w:p>
+    <w:p>
+      <w:pPr>
+        <w:pStyle w:val="ListBullet"/>
+      </w:pPr>
+      <w:r>
+        <w:t>Humidity promoted to a first-class sensor: DHT11 read through the Linux kernel IIO driver, with its own dashboard tile and live-feed chart.</w:t>
+      </w:r>
+    </w:p>
+    <w:p>
+      <w:pPr>
         <w:pStyle w:val="Heading1"/>
       </w:pPr>
       <w:r>
@@ -6706,11 +6761,7 @@
           </w:tcPr>
           <w:p>
             <w:r>
-              <w:rPr>
-                <w:rFonts w:ascii="Calibri" w:hAnsi="Calibri"/>
-                <w:sz w:val="20"/>
-              </w:rPr>
-              <w:t>Pi scripts not in repository</w:t>
+              <w:t>Pi deployment was manual (resolved)</w:t>
             </w:r>
           </w:p>
         </w:tc>
@@ -6721,11 +6772,7 @@
           </w:tcPr>
           <w:p>
             <w:r>
-              <w:rPr>
-                <w:rFonts w:ascii="Calibri" w:hAnsi="Calibri"/>
-                <w:sz w:val="20"/>
-              </w:rPr>
-              <w:t>Deployment requires manual Pi configuration</w:t>
+              <w:t>Initial setup required hand-configuration</w:t>
             </w:r>
           </w:p>
         </w:tc>
@@ -6736,11 +6783,7 @@
           </w:tcPr>
           <w:p>
             <w:r>
-              <w:rPr>
-                <w:rFonts w:ascii="Calibri" w:hAnsi="Calibri"/>
-                <w:sz w:val="20"/>
-              </w:rPr>
-              <w:t>Document in PRESENTATION.md; future: add to repo as raspberry_files/</w:t>
+              <w:t>pi_deploy/ now ships the publisher, camera streamer and setup_pi.sh; a crontab @reboot entry auto-starts everything</w:t>
             </w:r>
           </w:p>
         </w:tc>

</xml_diff>